<commit_message>
Press release: Kenya Guarnieri named in bio, About, and quote attribution
</commit_message>
<xml_diff>
--- a/docs/Code the Future — Press Release (DRAFT for Kenya).docx
+++ b/docs/Code the Future — Press Release (DRAFT for Kenya).docx
@@ -163,10 +163,10 @@
         <w:rPr>
           <w:b/>
         </w:rPr>
-        <w:t>[Kenya — full name]</w:t>
+        <w:t>Kenya Guarnieri</w:t>
       </w:r>
       <w:r>
-        <w:t>, is a licensed child psychologist who specializes in child development and a mother of two. She shaped the program’s design around how children in this age group actually learn, focus, and build confidence — and she reviews every module for age-appropriateness and emotional safety.</w:t>
+        <w:t>, is a licensed child psychologist who specializes in child development, with experience working with children on the autism spectrum, and a mother of two. She shaped the program’s design around how children in this age group actually learn, focus, and build confidence — and she reviews every module for age-appropriateness and emotional safety.</w:t>
       </w:r>
     </w:p>
     <w:p>
@@ -180,16 +180,7 @@
         <w:t xml:space="preserve">[Kenya — your quote here. Draft to revise:] </w:t>
       </w:r>
       <w:r>
-        <w:t xml:space="preserve">“Children this age are forming their relationship with technology right now. Our goal is to make that relationship a healthy, curious, and empowered one — where kids feel like creators, not just consumers,” said </w:t>
-      </w:r>
-      <w:r>
-        <w:rPr>
-          <w:b/>
-        </w:rPr>
-        <w:t>[Kenya — full name]</w:t>
-      </w:r>
-      <w:r>
-        <w:t>, co-founder of Code the Future.</w:t>
+        <w:t>“Children this age are forming their relationship with technology right now. Our goal is to make that relationship a healthy, curious, and empowered one — where kids feel like creators, not just consumers,” said Kenya Guarnieri, co-founder of Code the Future.</w:t>
       </w:r>
     </w:p>
     <w:p>
@@ -249,7 +240,7 @@
           <w:b w:val="0"/>
           <w:i w:val="0"/>
         </w:rPr>
-        <w:t>Code the Future is a Louisville-based AI-literacy program for children ages 8–11, combining an at-home learning platform with weekly hands-on sessions at a local public library. Founded in 2026 by Jon Nichols and [Kenya — full name], the program’s mission is to help the next generation grow up understanding artificial intelligence — and confident in their ability to use it to build a better future. Learn more at codethefuture.net.</w:t>
+        <w:t>Code the Future is a Louisville-based AI-literacy program for children ages 8–11, combining an at-home learning platform with weekly hands-on sessions at a local public library. Founded in 2026 by Jon Nichols and Kenya Guarnieri, the program’s mission is to help the next generation grow up understanding artificial intelligence — and confident in their ability to use it to build a better future. Learn more at codethefuture.net.</w:t>
       </w:r>
     </w:p>
     <w:p>
@@ -309,7 +300,7 @@
           <w:color w:val="888888"/>
           <w:sz w:val="18"/>
         </w:rPr>
-        <w:t>Editor’s notes (delete before sending): Fill the bracketed items — release date, Kenya’s full name + exact credential wording (Kenya: please confirm how you want your license described), the specific library branch if naming it, and the media-contact line. The Jon and Kenya quotes are drafts; Kenya’s is a placeholder to rewrite in her own voice. No enrollment numbers are included — add “a founding cohort of five Louisville families” if you want the local-color specificity. To swap the logo, it’s already embedded at the top; replace via right-click if needed.</w:t>
+        <w:t>Editor’s notes (delete before sending): Fill the remaining brackets — release date, the specific library branch if naming it, and the media-contact line. Kenya: confirm your exact license/credential wording, and rewrite the placeholder quote in your own voice. No enrollment numbers are included — add “a founding cohort of five Louisville families” if you want the local-color specificity. The logo is already embedded at the top.</w:t>
       </w:r>
     </w:p>
     <w:sectPr>

</xml_diff>